<commit_message>
Anthropic-style redesign for web UI and document generators
- Updated web UI with Inter + Source Serif fonts, purple/orange accents, soft gradients
- Redesigned business card with dual accent sidebar and Anthropic color palette
- Redesigned email signature with clean layout and accent separators
- Redesigned PPTX slides with refined typography and colored accents
- Redesigned DOCX proposal with styled table headers and modern layout
- Updated brandbook.json and README screenshots

Co-Authored-By: Claude <noreply@anthropic.com>
</commit_message>
<xml_diff>
--- a/docs/proposal-example.docx
+++ b/docs/proposal-example.docx
@@ -4,14 +4,13 @@
   <w:body>
     <w:p>
       <w:pPr>
-        <w:pStyle w:val="Title"/>
         <w:jc w:val="center"/>
       </w:pPr>
       <w:r>
         <w:rPr>
           <w:b/>
-          <w:color w:val="003366"/>
-          <w:sz w:val="44"/>
+          <w:color w:val="1F1F1E"/>
+          <w:sz w:val="52"/>
         </w:rPr>
         <w:t>Коммерческое предложение</w:t>
       </w:r>
@@ -22,69 +21,134 @@
       </w:pPr>
       <w:r>
         <w:rPr>
+          <w:color w:val="1F1F1E"/>
+          <w:sz w:val="24"/>
+        </w:rPr>
+        <w:t>ООО ТехноДиагностика</w:t>
+        <w:br/>
+      </w:r>
+      <w:r>
+        <w:rPr>
+          <w:i/>
+          <w:color w:val="5A4BFF"/>
+          <w:sz w:val="22"/>
+        </w:rPr>
+        <w:t>Надёжная диагностика — надёжное производство</w:t>
+      </w:r>
+    </w:p>
+    <w:p>
+      <w:pPr>
+        <w:spacing w:before="320"/>
+      </w:pPr>
+      <w:r>
+        <w:rPr>
           <w:b/>
+          <w:color w:val="1F1F1E"/>
+          <w:sz w:val="24"/>
         </w:rPr>
         <w:t>Для: ООО РоторПром</w:t>
       </w:r>
     </w:p>
     <w:p>
+      <w:pPr>
+        <w:spacing w:before="160" w:after="240"/>
+      </w:pPr>
       <w:r>
         <w:rPr>
-          <w:b/>
+          <w:color w:val="1F1F1E"/>
+          <w:sz w:val="22"/>
         </w:rPr>
-        <w:t>От: ООО ТехноДиагностика</w:t>
-      </w:r>
-      <w:r>
-        <w:br/>
-        <w:t>Надёжная диагностика — надёжное производство</w:t>
-      </w:r>
-    </w:p>
-    <w:p/>
-    <w:p>
-      <w:r>
         <w:t>ООО ТехноДиагностика предлагает выполнить работы для ООО РоторПром в соответствии с нижеуказанным перечнем услуг и условиями.</w:t>
       </w:r>
     </w:p>
-    <w:p/>
     <w:tbl>
       <w:tblPr>
-        <w:tblStyle w:val="TableGrid"/>
         <w:tblW w:type="auto" w:w="0"/>
+        <w:jc w:val="center"/>
+        <w:tblLayout w:type="fixed"/>
         <w:tblLook w:firstColumn="1" w:firstRow="1" w:lastColumn="0" w:lastRow="0" w:noHBand="0" w:noVBand="1" w:val="04A0"/>
       </w:tblPr>
       <w:tblGrid>
-        <w:gridCol w:w="2880"/>
-        <w:gridCol w:w="2880"/>
-        <w:gridCol w:w="2880"/>
+        <w:gridCol w:w="864"/>
+        <w:gridCol w:w="6480"/>
+        <w:gridCol w:w="2160"/>
       </w:tblGrid>
       <w:tr>
         <w:tc>
           <w:tcPr>
-            <w:tcW w:type="dxa" w:w="2880"/>
+            <w:tcW w:type="dxa" w:w="3216"/>
+            <w:shd w:fill="5A4BFF"/>
+            <w:tcBorders>
+              <w:top w:val="single" w:sz="6" w:color="5A4BFF"/>
+              <w:left w:val="single" w:sz="6" w:color="5A4BFF"/>
+              <w:bottom w:val="single" w:sz="6" w:color="5A4BFF"/>
+              <w:right w:val="single" w:sz="6" w:color="5A4BFF"/>
+            </w:tcBorders>
           </w:tcPr>
           <w:p>
+            <w:pPr>
+              <w:jc w:val="center"/>
+            </w:pPr>
+            <w:r/>
             <w:r>
+              <w:rPr>
+                <w:b/>
+                <w:color w:val="FFFFFF"/>
+                <w:sz w:val="22"/>
+              </w:rPr>
               <w:t>№</w:t>
             </w:r>
           </w:p>
         </w:tc>
         <w:tc>
           <w:tcPr>
-            <w:tcW w:type="dxa" w:w="2880"/>
+            <w:tcW w:type="dxa" w:w="3216"/>
+            <w:shd w:fill="5A4BFF"/>
+            <w:tcBorders>
+              <w:top w:val="single" w:sz="6" w:color="5A4BFF"/>
+              <w:left w:val="single" w:sz="6" w:color="5A4BFF"/>
+              <w:bottom w:val="single" w:sz="6" w:color="5A4BFF"/>
+              <w:right w:val="single" w:sz="6" w:color="5A4BFF"/>
+            </w:tcBorders>
           </w:tcPr>
           <w:p>
+            <w:pPr>
+              <w:jc w:val="center"/>
+            </w:pPr>
+            <w:r/>
             <w:r>
+              <w:rPr>
+                <w:b/>
+                <w:color w:val="FFFFFF"/>
+                <w:sz w:val="22"/>
+              </w:rPr>
               <w:t>Услуга</w:t>
             </w:r>
           </w:p>
         </w:tc>
         <w:tc>
           <w:tcPr>
-            <w:tcW w:type="dxa" w:w="2880"/>
+            <w:tcW w:type="dxa" w:w="3216"/>
+            <w:shd w:fill="5A4BFF"/>
+            <w:tcBorders>
+              <w:top w:val="single" w:sz="6" w:color="5A4BFF"/>
+              <w:left w:val="single" w:sz="6" w:color="5A4BFF"/>
+              <w:bottom w:val="single" w:sz="6" w:color="5A4BFF"/>
+              <w:right w:val="single" w:sz="6" w:color="5A4BFF"/>
+            </w:tcBorders>
           </w:tcPr>
           <w:p>
+            <w:pPr>
+              <w:jc w:val="center"/>
+            </w:pPr>
+            <w:r/>
             <w:r>
-              <w:t>Стоимость, руб.</w:t>
+              <w:rPr>
+                <w:b/>
+                <w:color w:val="FFFFFF"/>
+                <w:sz w:val="22"/>
+              </w:rPr>
+              <w:t>Стоимость, ₽</w:t>
             </w:r>
           </w:p>
         </w:tc>
@@ -92,30 +156,72 @@
       <w:tr>
         <w:tc>
           <w:tcPr>
-            <w:tcW w:type="dxa" w:w="2880"/>
+            <w:tcW w:type="dxa" w:w="864"/>
+            <w:tcBorders>
+              <w:top w:val="single" w:sz="6" w:color="E8E8E6"/>
+              <w:left w:val="single" w:sz="6" w:color="E8E8E6"/>
+              <w:bottom w:val="single" w:sz="6" w:color="E8E8E6"/>
+              <w:right w:val="single" w:sz="6" w:color="E8E8E6"/>
+            </w:tcBorders>
           </w:tcPr>
           <w:p>
+            <w:pPr>
+              <w:jc w:val="center"/>
+            </w:pPr>
+            <w:r/>
             <w:r>
+              <w:rPr>
+                <w:color w:val="1F1F1E"/>
+                <w:sz w:val="22"/>
+              </w:rPr>
               <w:t>1</w:t>
             </w:r>
           </w:p>
         </w:tc>
         <w:tc>
           <w:tcPr>
-            <w:tcW w:type="dxa" w:w="2880"/>
+            <w:tcW w:type="dxa" w:w="6480"/>
+            <w:tcBorders>
+              <w:top w:val="single" w:sz="6" w:color="E8E8E6"/>
+              <w:left w:val="single" w:sz="6" w:color="E8E8E6"/>
+              <w:bottom w:val="single" w:sz="6" w:color="E8E8E6"/>
+              <w:right w:val="single" w:sz="6" w:color="E8E8E6"/>
+            </w:tcBorders>
           </w:tcPr>
           <w:p>
+            <w:pPr>
+              <w:jc w:val="left"/>
+            </w:pPr>
+            <w:r/>
             <w:r>
-              <w:t>Поставка системы</w:t>
+              <w:rPr>
+                <w:color w:val="1F1F1E"/>
+                <w:sz w:val="22"/>
+              </w:rPr>
+              <w:t>Поставка системы вибродиагностики</w:t>
             </w:r>
           </w:p>
         </w:tc>
         <w:tc>
           <w:tcPr>
-            <w:tcW w:type="dxa" w:w="2880"/>
+            <w:tcW w:type="dxa" w:w="2160"/>
+            <w:tcBorders>
+              <w:top w:val="single" w:sz="6" w:color="E8E8E6"/>
+              <w:left w:val="single" w:sz="6" w:color="E8E8E6"/>
+              <w:bottom w:val="single" w:sz="6" w:color="E8E8E6"/>
+              <w:right w:val="single" w:sz="6" w:color="E8E8E6"/>
+            </w:tcBorders>
           </w:tcPr>
           <w:p>
+            <w:pPr>
+              <w:jc w:val="center"/>
+            </w:pPr>
+            <w:r/>
             <w:r>
+              <w:rPr>
+                <w:color w:val="1F1F1E"/>
+                <w:sz w:val="22"/>
+              </w:rPr>
               <w:t>1 250 000</w:t>
             </w:r>
           </w:p>
@@ -124,30 +230,72 @@
       <w:tr>
         <w:tc>
           <w:tcPr>
-            <w:tcW w:type="dxa" w:w="2880"/>
+            <w:tcW w:type="dxa" w:w="864"/>
+            <w:tcBorders>
+              <w:top w:val="single" w:sz="6" w:color="E8E8E6"/>
+              <w:left w:val="single" w:sz="6" w:color="E8E8E6"/>
+              <w:bottom w:val="single" w:sz="6" w:color="E8E8E6"/>
+              <w:right w:val="single" w:sz="6" w:color="E8E8E6"/>
+            </w:tcBorders>
           </w:tcPr>
           <w:p>
+            <w:pPr>
+              <w:jc w:val="center"/>
+            </w:pPr>
+            <w:r/>
             <w:r>
+              <w:rPr>
+                <w:color w:val="1F1F1E"/>
+                <w:sz w:val="22"/>
+              </w:rPr>
               <w:t>2</w:t>
             </w:r>
           </w:p>
         </w:tc>
         <w:tc>
           <w:tcPr>
-            <w:tcW w:type="dxa" w:w="2880"/>
+            <w:tcW w:type="dxa" w:w="6480"/>
+            <w:tcBorders>
+              <w:top w:val="single" w:sz="6" w:color="E8E8E6"/>
+              <w:left w:val="single" w:sz="6" w:color="E8E8E6"/>
+              <w:bottom w:val="single" w:sz="6" w:color="E8E8E6"/>
+              <w:right w:val="single" w:sz="6" w:color="E8E8E6"/>
+            </w:tcBorders>
           </w:tcPr>
           <w:p>
+            <w:pPr>
+              <w:jc w:val="left"/>
+            </w:pPr>
+            <w:r/>
             <w:r>
+              <w:rPr>
+                <w:color w:val="1F1F1E"/>
+                <w:sz w:val="22"/>
+              </w:rPr>
               <w:t>Монтаж и пусконаладка</w:t>
             </w:r>
           </w:p>
         </w:tc>
         <w:tc>
           <w:tcPr>
-            <w:tcW w:type="dxa" w:w="2880"/>
+            <w:tcW w:type="dxa" w:w="2160"/>
+            <w:tcBorders>
+              <w:top w:val="single" w:sz="6" w:color="E8E8E6"/>
+              <w:left w:val="single" w:sz="6" w:color="E8E8E6"/>
+              <w:bottom w:val="single" w:sz="6" w:color="E8E8E6"/>
+              <w:right w:val="single" w:sz="6" w:color="E8E8E6"/>
+            </w:tcBorders>
           </w:tcPr>
           <w:p>
+            <w:pPr>
+              <w:jc w:val="center"/>
+            </w:pPr>
+            <w:r/>
             <w:r>
+              <w:rPr>
+                <w:color w:val="1F1F1E"/>
+                <w:sz w:val="22"/>
+              </w:rPr>
               <w:t>280 000</w:t>
             </w:r>
           </w:p>
@@ -156,30 +304,72 @@
       <w:tr>
         <w:tc>
           <w:tcPr>
-            <w:tcW w:type="dxa" w:w="2880"/>
+            <w:tcW w:type="dxa" w:w="864"/>
+            <w:tcBorders>
+              <w:top w:val="single" w:sz="6" w:color="E8E8E6"/>
+              <w:left w:val="single" w:sz="6" w:color="E8E8E6"/>
+              <w:bottom w:val="single" w:sz="6" w:color="E8E8E6"/>
+              <w:right w:val="single" w:sz="6" w:color="E8E8E6"/>
+            </w:tcBorders>
           </w:tcPr>
           <w:p>
+            <w:pPr>
+              <w:jc w:val="center"/>
+            </w:pPr>
+            <w:r/>
             <w:r>
+              <w:rPr>
+                <w:color w:val="1F1F1E"/>
+                <w:sz w:val="22"/>
+              </w:rPr>
               <w:t>3</w:t>
             </w:r>
           </w:p>
         </w:tc>
         <w:tc>
           <w:tcPr>
-            <w:tcW w:type="dxa" w:w="2880"/>
+            <w:tcW w:type="dxa" w:w="6480"/>
+            <w:tcBorders>
+              <w:top w:val="single" w:sz="6" w:color="E8E8E6"/>
+              <w:left w:val="single" w:sz="6" w:color="E8E8E6"/>
+              <w:bottom w:val="single" w:sz="6" w:color="E8E8E6"/>
+              <w:right w:val="single" w:sz="6" w:color="E8E8E6"/>
+            </w:tcBorders>
           </w:tcPr>
           <w:p>
+            <w:pPr>
+              <w:jc w:val="left"/>
+            </w:pPr>
+            <w:r/>
             <w:r>
+              <w:rPr>
+                <w:color w:val="1F1F1E"/>
+                <w:sz w:val="22"/>
+              </w:rPr>
               <w:t>Обучение персонала</w:t>
             </w:r>
           </w:p>
         </w:tc>
         <w:tc>
           <w:tcPr>
-            <w:tcW w:type="dxa" w:w="2880"/>
+            <w:tcW w:type="dxa" w:w="2160"/>
+            <w:tcBorders>
+              <w:top w:val="single" w:sz="6" w:color="E8E8E6"/>
+              <w:left w:val="single" w:sz="6" w:color="E8E8E6"/>
+              <w:bottom w:val="single" w:sz="6" w:color="E8E8E6"/>
+              <w:right w:val="single" w:sz="6" w:color="E8E8E6"/>
+            </w:tcBorders>
           </w:tcPr>
           <w:p>
+            <w:pPr>
+              <w:jc w:val="center"/>
+            </w:pPr>
+            <w:r/>
             <w:r>
+              <w:rPr>
+                <w:color w:val="1F1F1E"/>
+                <w:sz w:val="22"/>
+              </w:rPr>
               <w:t>120 000</w:t>
             </w:r>
           </w:p>
@@ -188,7 +378,7 @@
       <w:tr>
         <w:tc>
           <w:tcPr>
-            <w:tcW w:type="dxa" w:w="2880"/>
+            <w:tcW w:type="dxa" w:w="864"/>
           </w:tcPr>
           <w:p>
             <w:r/>
@@ -196,12 +386,25 @@
         </w:tc>
         <w:tc>
           <w:tcPr>
-            <w:tcW w:type="dxa" w:w="2880"/>
+            <w:tcW w:type="dxa" w:w="6480"/>
+            <w:shd w:fill="EDE9FF"/>
+            <w:tcBorders>
+              <w:top w:val="single" w:sz="6" w:color="5A4BFF"/>
+              <w:left w:val="single" w:sz="6" w:color="5A4BFF"/>
+              <w:bottom w:val="single" w:sz="6" w:color="5A4BFF"/>
+              <w:right w:val="single" w:sz="6" w:color="5A4BFF"/>
+            </w:tcBorders>
           </w:tcPr>
           <w:p>
+            <w:pPr>
+              <w:jc w:val="right"/>
+            </w:pPr>
+            <w:r/>
             <w:r>
               <w:rPr>
                 <w:b/>
+                <w:color w:val="1F1F1E"/>
+                <w:sz w:val="24"/>
               </w:rPr>
               <w:t>Итого</w:t>
             </w:r>
@@ -209,12 +412,25 @@
         </w:tc>
         <w:tc>
           <w:tcPr>
-            <w:tcW w:type="dxa" w:w="2880"/>
+            <w:tcW w:type="dxa" w:w="2160"/>
+            <w:shd w:fill="EDE9FF"/>
+            <w:tcBorders>
+              <w:top w:val="single" w:sz="6" w:color="5A4BFF"/>
+              <w:left w:val="single" w:sz="6" w:color="5A4BFF"/>
+              <w:bottom w:val="single" w:sz="6" w:color="5A4BFF"/>
+              <w:right w:val="single" w:sz="6" w:color="5A4BFF"/>
+            </w:tcBorders>
           </w:tcPr>
           <w:p>
+            <w:pPr>
+              <w:jc w:val="center"/>
+            </w:pPr>
+            <w:r/>
             <w:r>
               <w:rPr>
                 <w:b/>
+                <w:color w:val="1F1F1E"/>
+                <w:sz w:val="24"/>
               </w:rPr>
               <w:t>1 650 000</w:t>
             </w:r>
@@ -227,44 +443,80 @@
       <w:r>
         <w:rPr>
           <w:b/>
+          <w:color w:val="1F1F1E"/>
+          <w:sz w:val="22"/>
         </w:rPr>
         <w:t xml:space="preserve">Сроки выполнения: </w:t>
       </w:r>
       <w:r>
-        <w:t>30 рабочих дней</w:t>
+        <w:rPr>
+          <w:color w:val="1F1F1E"/>
+          <w:sz w:val="22"/>
+        </w:rPr>
+        <w:t>30 рабочих дней с момента подписания договора</w:t>
       </w:r>
     </w:p>
     <w:p>
       <w:r>
         <w:rPr>
           <w:b/>
+          <w:color w:val="1F1F1E"/>
+          <w:sz w:val="22"/>
         </w:rPr>
         <w:t xml:space="preserve">Условия оплаты: </w:t>
       </w:r>
       <w:r>
-        <w:t>50/50</w:t>
+        <w:rPr>
+          <w:color w:val="1F1F1E"/>
+          <w:sz w:val="22"/>
+        </w:rPr>
+        <w:t>50% предоплата, 50% после ввода в эксплуатацию</w:t>
       </w:r>
     </w:p>
     <w:p/>
     <w:p>
+      <w:pPr>
+        <w:spacing w:before="240"/>
+      </w:pPr>
       <w:r>
         <w:rPr>
           <w:b/>
+          <w:color w:val="5A4BFF"/>
+          <w:sz w:val="24"/>
         </w:rPr>
-        <w:t>Контакты для связи:</w:t>
-        <w:br/>
+        <w:t>Контакты для связи</w:t>
       </w:r>
+    </w:p>
+    <w:p>
       <w:r>
+        <w:rPr>
+          <w:color w:val="1F1F1E"/>
+          <w:sz w:val="22"/>
+        </w:rPr>
         <w:t>+7 495 123-45-67</w:t>
-        <w:br/>
+      </w:r>
+    </w:p>
+    <w:p>
+      <w:r>
+        <w:rPr>
+          <w:color w:val="1F1F1E"/>
+          <w:sz w:val="22"/>
+        </w:rPr>
         <w:t>info@techdiagnostika.ru</w:t>
-        <w:br/>
+      </w:r>
+    </w:p>
+    <w:p>
+      <w:r>
+        <w:rPr>
+          <w:color w:val="1F1F1E"/>
+          <w:sz w:val="22"/>
+        </w:rPr>
         <w:t>techdiagnostika.ru</w:t>
       </w:r>
     </w:p>
     <w:sectPr>
       <w:pgSz w:w="12240" w:h="15840"/>
-      <w:pgMar w:top="1440" w:right="1800" w:bottom="1440" w:left="1800" w:header="720" w:footer="720" w:gutter="0"/>
+      <w:pgMar w:top="1008" w:right="1296" w:bottom="1008" w:left="1296" w:header="720" w:footer="720" w:gutter="0"/>
       <w:cols w:space="720"/>
       <w:docGrid w:linePitch="360"/>
     </w:sectPr>

</xml_diff>

<commit_message>
feat: logo upload and rendering in all materials
- Add optional logo upload to /api/brandbook and web UI
- Render logo in business cards, presentations, proposals and email signatures
- Add SVG-to-PNG conversion via svglib/rlPyCairo for print materials
- Add --logo flag to CLI upload-brandbook command
- Update README and regenerate docs examples

Co-Authored-By: Claude <noreply@anthropic.com>
</commit_message>
<xml_diff>
--- a/docs/proposal-example.docx
+++ b/docs/proposal-example.docx
@@ -34,6 +34,45 @@
           <w:sz w:val="22"/>
         </w:rPr>
         <w:t>Надёжная диагностика — надёжное производство</w:t>
+      </w:r>
+    </w:p>
+    <w:p>
+      <w:pPr>
+        <w:jc w:val="right"/>
+      </w:pPr>
+      <w:r>
+        <w:drawing>
+          <wp:inline xmlns:a="http://schemas.openxmlformats.org/drawingml/2006/main" xmlns:pic="http://schemas.openxmlformats.org/drawingml/2006/picture">
+            <wp:extent cx="1097280" cy="329184"/>
+            <wp:docPr id="1" name="Picture 1"/>
+            <wp:cNvGraphicFramePr>
+              <a:graphicFrameLocks noChangeAspect="1"/>
+            </wp:cNvGraphicFramePr>
+            <a:graphic>
+              <a:graphicData uri="http://schemas.openxmlformats.org/drawingml/2006/picture">
+                <pic:pic>
+                  <pic:nvPicPr>
+                    <pic:cNvPr id="0" name="logo.png"/>
+                    <pic:cNvPicPr/>
+                  </pic:nvPicPr>
+                  <pic:blipFill>
+                    <a:blip r:embed="rId9"/>
+                    <a:stretch>
+                      <a:fillRect/>
+                    </a:stretch>
+                  </pic:blipFill>
+                  <pic:spPr>
+                    <a:xfrm>
+                      <a:off x="0" y="0"/>
+                      <a:ext cx="1097280" cy="329184"/>
+                    </a:xfrm>
+                    <a:prstGeom prst="rect"/>
+                  </pic:spPr>
+                </pic:pic>
+              </a:graphicData>
+            </a:graphic>
+          </wp:inline>
+        </w:drawing>
       </w:r>
     </w:p>
     <w:p>
@@ -305,80 +344,6 @@
         <w:tc>
           <w:tcPr>
             <w:tcW w:type="dxa" w:w="864"/>
-            <w:tcBorders>
-              <w:top w:val="single" w:sz="6" w:color="E8E8E6"/>
-              <w:left w:val="single" w:sz="6" w:color="E8E8E6"/>
-              <w:bottom w:val="single" w:sz="6" w:color="E8E8E6"/>
-              <w:right w:val="single" w:sz="6" w:color="E8E8E6"/>
-            </w:tcBorders>
-          </w:tcPr>
-          <w:p>
-            <w:pPr>
-              <w:jc w:val="center"/>
-            </w:pPr>
-            <w:r/>
-            <w:r>
-              <w:rPr>
-                <w:color w:val="1F1F1E"/>
-                <w:sz w:val="22"/>
-              </w:rPr>
-              <w:t>3</w:t>
-            </w:r>
-          </w:p>
-        </w:tc>
-        <w:tc>
-          <w:tcPr>
-            <w:tcW w:type="dxa" w:w="6480"/>
-            <w:tcBorders>
-              <w:top w:val="single" w:sz="6" w:color="E8E8E6"/>
-              <w:left w:val="single" w:sz="6" w:color="E8E8E6"/>
-              <w:bottom w:val="single" w:sz="6" w:color="E8E8E6"/>
-              <w:right w:val="single" w:sz="6" w:color="E8E8E6"/>
-            </w:tcBorders>
-          </w:tcPr>
-          <w:p>
-            <w:pPr>
-              <w:jc w:val="left"/>
-            </w:pPr>
-            <w:r/>
-            <w:r>
-              <w:rPr>
-                <w:color w:val="1F1F1E"/>
-                <w:sz w:val="22"/>
-              </w:rPr>
-              <w:t>Обучение персонала</w:t>
-            </w:r>
-          </w:p>
-        </w:tc>
-        <w:tc>
-          <w:tcPr>
-            <w:tcW w:type="dxa" w:w="2160"/>
-            <w:tcBorders>
-              <w:top w:val="single" w:sz="6" w:color="E8E8E6"/>
-              <w:left w:val="single" w:sz="6" w:color="E8E8E6"/>
-              <w:bottom w:val="single" w:sz="6" w:color="E8E8E6"/>
-              <w:right w:val="single" w:sz="6" w:color="E8E8E6"/>
-            </w:tcBorders>
-          </w:tcPr>
-          <w:p>
-            <w:pPr>
-              <w:jc w:val="center"/>
-            </w:pPr>
-            <w:r/>
-            <w:r>
-              <w:rPr>
-                <w:color w:val="1F1F1E"/>
-                <w:sz w:val="22"/>
-              </w:rPr>
-              <w:t>120 000</w:t>
-            </w:r>
-          </w:p>
-        </w:tc>
-      </w:tr>
-      <w:tr>
-        <w:tc>
-          <w:tcPr>
-            <w:tcW w:type="dxa" w:w="864"/>
           </w:tcPr>
           <w:p>
             <w:r/>
@@ -432,7 +397,7 @@
                 <w:color w:val="1F1F1E"/>
                 <w:sz w:val="24"/>
               </w:rPr>
-              <w:t>1 650 000</w:t>
+              <w:t>1 530 000</w:t>
             </w:r>
           </w:p>
         </w:tc>
@@ -453,7 +418,7 @@
           <w:color w:val="1F1F1E"/>
           <w:sz w:val="22"/>
         </w:rPr>
-        <w:t>30 рабочих дней с момента подписания договора</w:t>
+        <w:t>30 рабочих дней</w:t>
       </w:r>
     </w:p>
     <w:p>
@@ -470,7 +435,7 @@
           <w:color w:val="1F1F1E"/>
           <w:sz w:val="22"/>
         </w:rPr>
-        <w:t>50% предоплата, 50% после ввода в эксплуатацию</w:t>
+        <w:t>50% предоплата, 50% по завершении</w:t>
       </w:r>
     </w:p>
     <w:p/>

</xml_diff>